<commit_message>
lci fl ready, kel & glaxo modification
</commit_message>
<xml_diff>
--- a/glaxo-6942-MIK/GLAXO-6942-TSQ-26-02.docx
+++ b/glaxo-6942-MIK/GLAXO-6942-TSQ-26-02.docx
@@ -180,7 +180,25 @@
           <w:szCs w:val="20"/>
           <w:u w:val="none"/>
         </w:rPr>
-        <w:t>March 12, 2026</w:t>
+        <w:t xml:space="preserve">March </w:t>
+      </w:r>
+      <w:r>
+        <w:rPr>
+          <w:color w:val="auto"/>
+          <w:sz w:val="20"/>
+          <w:szCs w:val="20"/>
+          <w:u w:val="none"/>
+        </w:rPr>
+        <w:t>27</w:t>
+      </w:r>
+      <w:r>
+        <w:rPr>
+          <w:color w:val="auto"/>
+          <w:sz w:val="20"/>
+          <w:szCs w:val="20"/>
+          <w:u w:val="none"/>
+        </w:rPr>
+        <w:t>, 2026</w:t>
       </w:r>
     </w:p>
     <w:p>
@@ -835,6 +853,24 @@
       </w:pPr>
       <w:r>
         <w:rPr>
+          <w:sz w:val="20"/>
+          <w:szCs w:val="20"/>
+        </w:rPr>
+      </w:r>
+    </w:p>
+    <w:p>
+      <w:pPr>
+        <w:pStyle w:val="Default"/>
+        <w:tabs>
+          <w:tab w:val="clear" w:pos="720"/>
+          <w:tab w:val="left" w:pos="400" w:leader="none"/>
+        </w:tabs>
+        <w:bidi w:val="0"/>
+        <w:jc w:val="start"/>
+        <w:rPr/>
+      </w:pPr>
+      <w:r>
+        <w:rPr>
           <w:b w:val="false"/>
           <w:strike w:val="false"/>
           <w:dstrike w:val="false"/>
@@ -843,6 +879,29 @@
           <w:szCs w:val="20"/>
           <w:u w:val="none"/>
         </w:rPr>
+        <w:t>This acknowledges receiving a system generated Form for Transfer of Shares for the captioned company and your request tick marked “Transfer Dee(s) require as per new format (Format attached for resubmission)”.</w:t>
+      </w:r>
+    </w:p>
+    <w:p>
+      <w:pPr>
+        <w:pStyle w:val="Default"/>
+        <w:tabs>
+          <w:tab w:val="clear" w:pos="720"/>
+          <w:tab w:val="left" w:pos="400" w:leader="none"/>
+        </w:tabs>
+        <w:bidi w:val="0"/>
+        <w:jc w:val="start"/>
+        <w:rPr>
+          <w:rFonts w:ascii="Calibri" w:hAnsi="Calibri"/>
+          <w:sz w:val="20"/>
+          <w:szCs w:val="20"/>
+        </w:rPr>
+      </w:pPr>
+      <w:r>
+        <w:rPr>
+          <w:sz w:val="20"/>
+          <w:szCs w:val="20"/>
+        </w:rPr>
       </w:r>
     </w:p>
     <w:p>
@@ -866,125 +925,7 @@
           <w:szCs w:val="20"/>
           <w:u w:val="none"/>
         </w:rPr>
-        <w:t xml:space="preserve">This acknowledges receiving </w:t>
-      </w:r>
-      <w:r>
-        <w:rPr>
-          <w:b w:val="false"/>
-          <w:strike w:val="false"/>
-          <w:dstrike w:val="false"/>
-          <w:color w:val="auto"/>
-          <w:sz w:val="20"/>
-          <w:szCs w:val="20"/>
-          <w:u w:val="none"/>
-        </w:rPr>
-        <w:t xml:space="preserve">a system generated Form for Transfer of Shares for the captioned company and your </w:t>
-      </w:r>
-      <w:r>
-        <w:rPr>
-          <w:b w:val="false"/>
-          <w:strike w:val="false"/>
-          <w:dstrike w:val="false"/>
-          <w:color w:val="auto"/>
-          <w:sz w:val="20"/>
-          <w:szCs w:val="20"/>
-          <w:u w:val="none"/>
-        </w:rPr>
-        <w:t>request tick marked “</w:t>
-      </w:r>
-      <w:r>
-        <w:rPr>
-          <w:b w:val="false"/>
-          <w:strike w:val="false"/>
-          <w:dstrike w:val="false"/>
-          <w:color w:val="auto"/>
-          <w:sz w:val="20"/>
-          <w:szCs w:val="20"/>
-          <w:u w:val="none"/>
-        </w:rPr>
-        <w:t>Transfer Dee(s) require as per new format (Format attached for resubmission)</w:t>
-      </w:r>
-      <w:r>
-        <w:rPr>
-          <w:b w:val="false"/>
-          <w:strike w:val="false"/>
-          <w:dstrike w:val="false"/>
-          <w:color w:val="auto"/>
-          <w:sz w:val="20"/>
-          <w:szCs w:val="20"/>
-          <w:u w:val="none"/>
-        </w:rPr>
-        <w:t>”.</w:t>
-      </w:r>
-    </w:p>
-    <w:p>
-      <w:pPr>
-        <w:pStyle w:val="Default"/>
-        <w:tabs>
-          <w:tab w:val="clear" w:pos="720"/>
-          <w:tab w:val="left" w:pos="400" w:leader="none"/>
-        </w:tabs>
-        <w:bidi w:val="0"/>
-        <w:jc w:val="start"/>
-        <w:rPr>
-          <w:rFonts w:ascii="Calibri" w:hAnsi="Calibri"/>
-          <w:sz w:val="20"/>
-          <w:szCs w:val="20"/>
-        </w:rPr>
-      </w:pPr>
-      <w:r>
-        <w:rPr>
-          <w:sz w:val="20"/>
-          <w:szCs w:val="20"/>
-        </w:rPr>
-      </w:r>
-    </w:p>
-    <w:p>
-      <w:pPr>
-        <w:pStyle w:val="Default"/>
-        <w:tabs>
-          <w:tab w:val="clear" w:pos="720"/>
-          <w:tab w:val="left" w:pos="400" w:leader="none"/>
-        </w:tabs>
-        <w:bidi w:val="0"/>
-        <w:jc w:val="start"/>
-        <w:rPr/>
-      </w:pPr>
-      <w:r>
-        <w:rPr>
-          <w:b w:val="false"/>
-          <w:strike w:val="false"/>
-          <w:dstrike w:val="false"/>
-          <w:color w:val="auto"/>
-          <w:sz w:val="20"/>
-          <w:szCs w:val="20"/>
-          <w:u w:val="none"/>
-        </w:rPr>
-        <w:t xml:space="preserve">In this connection, please find enclosed </w:t>
-      </w:r>
-      <w:r>
-        <w:rPr>
-          <w:b w:val="false"/>
-          <w:strike w:val="false"/>
-          <w:dstrike w:val="false"/>
-          <w:color w:val="auto"/>
-          <w:sz w:val="20"/>
-          <w:szCs w:val="20"/>
-          <w:u w:val="none"/>
-        </w:rPr>
-        <w:t>the following for your further processing</w:t>
-      </w:r>
-      <w:r>
-        <w:rPr>
-          <w:b w:val="false"/>
-          <w:strike w:val="false"/>
-          <w:dstrike w:val="false"/>
-          <w:color w:val="auto"/>
-          <w:sz w:val="20"/>
-          <w:szCs w:val="20"/>
-          <w:u w:val="none"/>
-        </w:rPr>
-        <w:t>:</w:t>
+        <w:t>In this connection, please find enclosed the following for your further processing:</w:t>
       </w:r>
     </w:p>
     <w:p>
@@ -3002,7 +2943,7 @@
     <w:pPr>
       <w:widowControl/>
       <w:suppressAutoHyphens w:val="true"/>
-      <w:overflowPunct w:val="false"/>
+      <w:overflowPunct w:val="true"/>
       <w:bidi w:val="0"/>
       <w:snapToGrid w:val="false"/>
       <w:spacing w:before="0" w:after="0"/>
@@ -3054,8 +2995,8 @@
       <w:bCs/>
     </w:rPr>
   </w:style>
-  <w:style w:type="character" w:styleId="Bulletsuser">
-    <w:name w:val="Bullets (user)"/>
+  <w:style w:type="character" w:styleId="Bullets">
+    <w:name w:val="Bullets"/>
     <w:qFormat/>
     <w:rPr>
       <w:rFonts w:ascii="OpenSymbol" w:hAnsi="OpenSymbol" w:eastAsia="OpenSymbol" w:cs="OpenSymbol"/>
@@ -3158,7 +3099,7 @@
     <w:pPr>
       <w:widowControl/>
       <w:suppressAutoHyphens w:val="true"/>
-      <w:overflowPunct w:val="false"/>
+      <w:overflowPunct w:val="true"/>
       <w:bidi w:val="0"/>
       <w:spacing w:before="0" w:after="0"/>
       <w:jc w:val="start"/>

</xml_diff>